<commit_message>
Enhance reservation handling in inputgui: add error message for duplicate IDs
</commit_message>
<xml_diff>
--- a/Documentation.docx
+++ b/Documentation.docx
@@ -329,28 +329,7 @@
           <w:sz w:val="28"/>
           <w:szCs w:val="28"/>
         </w:rPr>
-        <w:t>M</w:t>
-      </w:r>
-      <w:r>
-        <w:rPr>
-          <w:sz w:val="28"/>
-          <w:szCs w:val="28"/>
-        </w:rPr>
-        <w:t>ohammed </w:t>
-      </w:r>
-      <w:r>
-        <w:rPr>
-          <w:sz w:val="28"/>
-          <w:szCs w:val="28"/>
-        </w:rPr>
-        <w:t>A</w:t>
-      </w:r>
-      <w:r>
-        <w:rPr>
-          <w:sz w:val="28"/>
-          <w:szCs w:val="28"/>
-        </w:rPr>
-        <w:t>lhatam</w:t>
+        <w:t>Mohammed Alhatam</w:t>
       </w:r>
       <w:r>
         <w:rPr>
@@ -377,14 +356,27 @@
         </w:rPr>
         <w:t>446108828</w:t>
       </w:r>
-      <w:r>
-        <w:rPr>
-          <w:sz w:val="28"/>
-          <w:szCs w:val="28"/>
-          <w:lang w:val="en-US"/>
-        </w:rPr>
-        <w:t xml:space="preserve"> </w:t>
-      </w:r>
+    </w:p>
+    <w:p>
+      <w:pPr>
+        <w:ind w:left="360"/>
+        <w:rPr>
+          <w:sz w:val="28"/>
+          <w:szCs w:val="28"/>
+          <w:lang w:val="en-US"/>
+        </w:rPr>
+      </w:pPr>
+      <w:hyperlink r:id="rId5" w:history="1">
+        <w:r>
+          <w:rPr>
+            <w:rStyle w:val="Hyperlink"/>
+            <w:sz w:val="28"/>
+            <w:szCs w:val="28"/>
+            <w:lang w:val="en-US"/>
+          </w:rPr>
+          <w:t>Our Repo</w:t>
+        </w:r>
+      </w:hyperlink>
     </w:p>
     <w:p>
       <w:pPr>
@@ -996,6 +988,7 @@
         <w:rPr>
           <w:i/>
           <w:iCs/>
+          <w:noProof/>
           <w:lang w:val="en-US"/>
         </w:rPr>
         <w:drawing>
@@ -1014,7 +1007,7 @@
                     <pic:cNvPicPr/>
                   </pic:nvPicPr>
                   <pic:blipFill>
-                    <a:blip r:embed="rId5">
+                    <a:blip r:embed="rId6">
                       <a:extLst>
                         <a:ext uri="{28A0092B-C50C-407E-A947-70E740481C1C}">
                           <a14:useLocalDpi xmlns:a14="http://schemas.microsoft.com/office/drawing/2010/main" val="0"/>
@@ -1054,6 +1047,7 @@
       </w:pPr>
       <w:r>
         <w:rPr>
+          <w:noProof/>
           <w:lang w:val="en-US"/>
         </w:rPr>
         <w:drawing>
@@ -1072,7 +1066,7 @@
                     <pic:cNvPicPr/>
                   </pic:nvPicPr>
                   <pic:blipFill>
-                    <a:blip r:embed="rId6"/>
+                    <a:blip r:embed="rId7"/>
                     <a:stretch>
                       <a:fillRect/>
                     </a:stretch>
@@ -1109,6 +1103,7 @@
         <w:rPr>
           <w:i/>
           <w:iCs/>
+          <w:noProof/>
           <w:sz w:val="28"/>
           <w:szCs w:val="28"/>
           <w:lang w:val="en-US"/>
@@ -1130,7 +1125,7 @@
                     <pic:cNvPicPr/>
                   </pic:nvPicPr>
                   <pic:blipFill>
-                    <a:blip r:embed="rId7"/>
+                    <a:blip r:embed="rId8"/>
                     <a:stretch>
                       <a:fillRect/>
                     </a:stretch>
@@ -1152,6 +1147,7 @@
       </w:r>
       <w:r>
         <w:rPr>
+          <w:noProof/>
           <w:sz w:val="28"/>
           <w:szCs w:val="28"/>
           <w:lang w:val="en-US"/>
@@ -1172,7 +1168,7 @@
                     <pic:cNvPicPr/>
                   </pic:nvPicPr>
                   <pic:blipFill>
-                    <a:blip r:embed="rId8"/>
+                    <a:blip r:embed="rId9"/>
                     <a:stretch>
                       <a:fillRect/>
                     </a:stretch>
@@ -1223,7 +1219,7 @@
                     <pic:cNvPicPr/>
                   </pic:nvPicPr>
                   <pic:blipFill>
-                    <a:blip r:embed="rId9"/>
+                    <a:blip r:embed="rId10"/>
                     <a:stretch>
                       <a:fillRect/>
                     </a:stretch>
@@ -1245,6 +1241,7 @@
       </w:r>
       <w:r>
         <w:rPr>
+          <w:noProof/>
           <w:sz w:val="28"/>
           <w:szCs w:val="28"/>
           <w:lang w:val="en-US"/>
@@ -1265,7 +1262,7 @@
                     <pic:cNvPicPr/>
                   </pic:nvPicPr>
                   <pic:blipFill>
-                    <a:blip r:embed="rId10"/>
+                    <a:blip r:embed="rId11"/>
                     <a:stretch>
                       <a:fillRect/>
                     </a:stretch>
@@ -1368,20 +1365,8 @@
           <w:szCs w:val="28"/>
           <w:lang w:val="en-US"/>
         </w:rPr>
-        <w:t xml:space="preserve">Screenshot </w:t>
-      </w:r>
-      <w:proofErr w:type="gramStart"/>
-      <w:r>
-        <w:rPr>
-          <w:b/>
-          <w:bCs/>
-          <w:sz w:val="28"/>
-          <w:szCs w:val="28"/>
-          <w:lang w:val="en-US"/>
-        </w:rPr>
-        <w:t>3</w:t>
-      </w:r>
-      <w:proofErr w:type="gramEnd"/>
+        <w:t>Screenshot 3</w:t>
+      </w:r>
       <w:r>
         <w:rPr>
           <w:b/>
@@ -3463,6 +3448,7 @@
   <w:style w:type="character" w:default="1" w:styleId="DefaultParagraphFont">
     <w:name w:val="Default Paragraph Font"/>
     <w:uiPriority w:val="1"/>
+    <w:semiHidden/>
     <w:unhideWhenUsed/>
   </w:style>
   <w:style w:type="table" w:default="1" w:styleId="TableNormal">
@@ -3572,6 +3558,29 @@
       <w:ind w:left="720"/>
       <w:contextualSpacing/>
     </w:pPr>
+  </w:style>
+  <w:style w:type="character" w:styleId="Hyperlink">
+    <w:name w:val="Hyperlink"/>
+    <w:basedOn w:val="DefaultParagraphFont"/>
+    <w:uiPriority w:val="99"/>
+    <w:unhideWhenUsed/>
+    <w:rsid w:val="00D35279"/>
+    <w:rPr>
+      <w:color w:val="0000FF" w:themeColor="hyperlink"/>
+      <w:u w:val="single"/>
+    </w:rPr>
+  </w:style>
+  <w:style w:type="character" w:styleId="UnresolvedMention">
+    <w:name w:val="Unresolved Mention"/>
+    <w:basedOn w:val="DefaultParagraphFont"/>
+    <w:uiPriority w:val="99"/>
+    <w:semiHidden/>
+    <w:unhideWhenUsed/>
+    <w:rsid w:val="00D35279"/>
+    <w:rPr>
+      <w:color w:val="605E5C"/>
+      <w:shd w:val="clear" w:color="auto" w:fill="E1DFDD"/>
+    </w:rPr>
   </w:style>
 </w:styles>
 </file>

</xml_diff>